<commit_message>
Strengthen OER release candidate QA
</commit_message>
<xml_diff>
--- a/CST4714_OER_Rebuild/publication/exports/operating_cloud_databases_v1.0.0-rc.1.docx
+++ b/CST4714_OER_Rebuild/publication/exports/operating_cloud_databases_v1.0.0-rc.1.docx
@@ -31,7 +31,7 @@
         <w:pStyle w:val="Date"/>
       </w:pPr>
       <w:r>
-        <w:t xml:space="preserve">2026-07-13</w:t>
+        <w:t xml:space="preserve">2026-08-09</w:t>
       </w:r>
     </w:p>
     <w:sdt>
@@ -47144,6 +47144,33 @@
         <w:br/>
       </w:r>
       <w:r>
+        <w:rPr>
+          <w:rStyle w:val="ImportTok"/>
+        </w:rPr>
+        <w:t xml:space="preserve">from</w:t>
+      </w:r>
+      <w:r>
+        <w:rPr>
+          <w:rStyle w:val="NormalTok"/>
+        </w:rPr>
+        <w:t xml:space="preserve"> pymongo.server_api </w:t>
+      </w:r>
+      <w:r>
+        <w:rPr>
+          <w:rStyle w:val="ImportTok"/>
+        </w:rPr>
+        <w:t xml:space="preserve">import</w:t>
+      </w:r>
+      <w:r>
+        <w:rPr>
+          <w:rStyle w:val="NormalTok"/>
+        </w:rPr>
+        <w:t xml:space="preserve"> ServerApi</w:t>
+      </w:r>
+      <w:r>
+        <w:br/>
+      </w:r>
+      <w:r>
         <w:br/>
       </w:r>
       <w:r>
@@ -47195,7 +47222,25 @@
         <w:rPr>
           <w:rStyle w:val="NormalTok"/>
         </w:rPr>
-        <w:t xml:space="preserve"> MongoClient(mongodb_uri, serverSelectionTimeoutMS</w:t>
+        <w:t xml:space="preserve"> MongoClient(</w:t>
+      </w:r>
+      <w:r>
+        <w:br/>
+      </w:r>
+      <w:r>
+        <w:rPr>
+          <w:rStyle w:val="NormalTok"/>
+        </w:rPr>
+        <w:t xml:space="preserve">    mongodb_uri,</w:t>
+      </w:r>
+      <w:r>
+        <w:br/>
+      </w:r>
+      <w:r>
+        <w:rPr>
+          <w:rStyle w:val="NormalTok"/>
+        </w:rPr>
+        <w:t xml:space="preserve">    server_api</w:t>
       </w:r>
       <w:r>
         <w:rPr>
@@ -47205,9 +47250,114 @@
       </w:r>
       <w:r>
         <w:rPr>
+          <w:rStyle w:val="NormalTok"/>
+        </w:rPr>
+        <w:t xml:space="preserve">ServerApi(</w:t>
+      </w:r>
+      <w:r>
+        <w:rPr>
+          <w:rStyle w:val="StringTok"/>
+        </w:rPr>
+        <w:t xml:space="preserve">"1"</w:t>
+      </w:r>
+      <w:r>
+        <w:rPr>
+          <w:rStyle w:val="NormalTok"/>
+        </w:rPr>
+        <w:t xml:space="preserve">, strict</w:t>
+      </w:r>
+      <w:r>
+        <w:rPr>
+          <w:rStyle w:val="OperatorTok"/>
+        </w:rPr>
+        <w:t xml:space="preserve">=</w:t>
+      </w:r>
+      <w:r>
+        <w:rPr>
+          <w:rStyle w:val="VariableTok"/>
+        </w:rPr>
+        <w:t xml:space="preserve">True</w:t>
+      </w:r>
+      <w:r>
+        <w:rPr>
+          <w:rStyle w:val="NormalTok"/>
+        </w:rPr>
+        <w:t xml:space="preserve">, deprecation_errors</w:t>
+      </w:r>
+      <w:r>
+        <w:rPr>
+          <w:rStyle w:val="OperatorTok"/>
+        </w:rPr>
+        <w:t xml:space="preserve">=</w:t>
+      </w:r>
+      <w:r>
+        <w:rPr>
+          <w:rStyle w:val="VariableTok"/>
+        </w:rPr>
+        <w:t xml:space="preserve">True</w:t>
+      </w:r>
+      <w:r>
+        <w:rPr>
+          <w:rStyle w:val="NormalTok"/>
+        </w:rPr>
+        <w:t xml:space="preserve">),</w:t>
+      </w:r>
+      <w:r>
+        <w:br/>
+      </w:r>
+      <w:r>
+        <w:rPr>
+          <w:rStyle w:val="NormalTok"/>
+        </w:rPr>
+        <w:t xml:space="preserve">    serverSelectionTimeoutMS</w:t>
+      </w:r>
+      <w:r>
+        <w:rPr>
+          <w:rStyle w:val="OperatorTok"/>
+        </w:rPr>
+        <w:t xml:space="preserve">=</w:t>
+      </w:r>
+      <w:r>
+        <w:rPr>
           <w:rStyle w:val="DecValTok"/>
         </w:rPr>
         <w:t xml:space="preserve">10000</w:t>
+      </w:r>
+      <w:r>
+        <w:rPr>
+          <w:rStyle w:val="NormalTok"/>
+        </w:rPr>
+        <w:t xml:space="preserve">,</w:t>
+      </w:r>
+      <w:r>
+        <w:br/>
+      </w:r>
+      <w:r>
+        <w:rPr>
+          <w:rStyle w:val="NormalTok"/>
+        </w:rPr>
+        <w:t xml:space="preserve">    timeoutMS</w:t>
+      </w:r>
+      <w:r>
+        <w:rPr>
+          <w:rStyle w:val="OperatorTok"/>
+        </w:rPr>
+        <w:t xml:space="preserve">=</w:t>
+      </w:r>
+      <w:r>
+        <w:rPr>
+          <w:rStyle w:val="DecValTok"/>
+        </w:rPr>
+        <w:t xml:space="preserve">10000</w:t>
+      </w:r>
+      <w:r>
+        <w:rPr>
+          <w:rStyle w:val="NormalTok"/>
+        </w:rPr>
+        <w:t xml:space="preserve">,</w:t>
+      </w:r>
+      <w:r>
+        <w:br/>
       </w:r>
       <w:r>
         <w:rPr>
@@ -47506,6 +47656,33 @@
         <w:br/>
       </w:r>
       <w:r>
+        <w:rPr>
+          <w:rStyle w:val="ImportTok"/>
+        </w:rPr>
+        <w:t xml:space="preserve">from</w:t>
+      </w:r>
+      <w:r>
+        <w:rPr>
+          <w:rStyle w:val="NormalTok"/>
+        </w:rPr>
+        <w:t xml:space="preserve"> psycopg.conninfo </w:t>
+      </w:r>
+      <w:r>
+        <w:rPr>
+          <w:rStyle w:val="ImportTok"/>
+        </w:rPr>
+        <w:t xml:space="preserve">import</w:t>
+      </w:r>
+      <w:r>
+        <w:rPr>
+          <w:rStyle w:val="NormalTok"/>
+        </w:rPr>
+        <w:t xml:space="preserve"> conninfo_to_dict</w:t>
+      </w:r>
+      <w:r>
+        <w:br/>
+      </w:r>
+      <w:r>
         <w:br/>
       </w:r>
       <w:r>
@@ -47543,8 +47720,176 @@
       </w:r>
       <w:r>
         <w:rPr>
+          <w:rStyle w:val="NormalTok"/>
+        </w:rPr>
+        <w:t xml:space="preserve">sslmode </w:t>
+      </w:r>
+      <w:r>
+        <w:rPr>
+          <w:rStyle w:val="OperatorTok"/>
+        </w:rPr>
+        <w:t xml:space="preserve">=</w:t>
+      </w:r>
+      <w:r>
+        <w:rPr>
+          <w:rStyle w:val="NormalTok"/>
+        </w:rPr>
+        <w:t xml:space="preserve"> conninfo_to_dict(database_url).get(</w:t>
+      </w:r>
+      <w:r>
+        <w:rPr>
+          <w:rStyle w:val="StringTok"/>
+        </w:rPr>
+        <w:t xml:space="preserve">"sslmode"</w:t>
+      </w:r>
+      <w:r>
+        <w:rPr>
+          <w:rStyle w:val="NormalTok"/>
+        </w:rPr>
+        <w:t xml:space="preserve">, </w:t>
+      </w:r>
+      <w:r>
+        <w:rPr>
+          <w:rStyle w:val="StringTok"/>
+        </w:rPr>
+        <w:t xml:space="preserve">"prefer"</w:t>
+      </w:r>
+      <w:r>
+        <w:rPr>
+          <w:rStyle w:val="NormalTok"/>
+        </w:rPr>
+        <w:t xml:space="preserve">)</w:t>
+      </w:r>
+      <w:r>
+        <w:br/>
+      </w:r>
+      <w:r>
+        <w:rPr>
           <w:rStyle w:val="ControlFlowTok"/>
         </w:rPr>
+        <w:t xml:space="preserve">if</w:t>
+      </w:r>
+      <w:r>
+        <w:rPr>
+          <w:rStyle w:val="NormalTok"/>
+        </w:rPr>
+        <w:t xml:space="preserve"> sslmode </w:t>
+      </w:r>
+      <w:r>
+        <w:rPr>
+          <w:rStyle w:val="KeywordTok"/>
+        </w:rPr>
+        <w:t xml:space="preserve">not</w:t>
+      </w:r>
+      <w:r>
+        <w:rPr>
+          <w:rStyle w:val="NormalTok"/>
+        </w:rPr>
+        <w:t xml:space="preserve"> </w:t>
+      </w:r>
+      <w:r>
+        <w:rPr>
+          <w:rStyle w:val="KeywordTok"/>
+        </w:rPr>
+        <w:t xml:space="preserve">in</w:t>
+      </w:r>
+      <w:r>
+        <w:rPr>
+          <w:rStyle w:val="NormalTok"/>
+        </w:rPr>
+        <w:t xml:space="preserve"> {</w:t>
+      </w:r>
+      <w:r>
+        <w:rPr>
+          <w:rStyle w:val="StringTok"/>
+        </w:rPr>
+        <w:t xml:space="preserve">"require"</w:t>
+      </w:r>
+      <w:r>
+        <w:rPr>
+          <w:rStyle w:val="NormalTok"/>
+        </w:rPr>
+        <w:t xml:space="preserve">, </w:t>
+      </w:r>
+      <w:r>
+        <w:rPr>
+          <w:rStyle w:val="StringTok"/>
+        </w:rPr>
+        <w:t xml:space="preserve">"verify-ca"</w:t>
+      </w:r>
+      <w:r>
+        <w:rPr>
+          <w:rStyle w:val="NormalTok"/>
+        </w:rPr>
+        <w:t xml:space="preserve">, </w:t>
+      </w:r>
+      <w:r>
+        <w:rPr>
+          <w:rStyle w:val="StringTok"/>
+        </w:rPr>
+        <w:t xml:space="preserve">"verify-full"</w:t>
+      </w:r>
+      <w:r>
+        <w:rPr>
+          <w:rStyle w:val="NormalTok"/>
+        </w:rPr>
+        <w:t xml:space="preserve">}:</w:t>
+      </w:r>
+      <w:r>
+        <w:br/>
+      </w:r>
+      <w:r>
+        <w:rPr>
+          <w:rStyle w:val="NormalTok"/>
+        </w:rPr>
+        <w:t xml:space="preserve">    </w:t>
+      </w:r>
+      <w:r>
+        <w:rPr>
+          <w:rStyle w:val="ControlFlowTok"/>
+        </w:rPr>
+        <w:t xml:space="preserve">raise</w:t>
+      </w:r>
+      <w:r>
+        <w:rPr>
+          <w:rStyle w:val="NormalTok"/>
+        </w:rPr>
+        <w:t xml:space="preserve"> </w:t>
+      </w:r>
+      <w:r>
+        <w:rPr>
+          <w:rStyle w:val="PreprocessorTok"/>
+        </w:rPr>
+        <w:t xml:space="preserve">ValueError</w:t>
+      </w:r>
+      <w:r>
+        <w:rPr>
+          <w:rStyle w:val="NormalTok"/>
+        </w:rPr>
+        <w:t xml:space="preserve">(</w:t>
+      </w:r>
+      <w:r>
+        <w:rPr>
+          <w:rStyle w:val="StringTok"/>
+        </w:rPr>
+        <w:t xml:space="preserve">"Add sslmode=require or a stronger mode to the URL."</w:t>
+      </w:r>
+      <w:r>
+        <w:rPr>
+          <w:rStyle w:val="NormalTok"/>
+        </w:rPr>
+        <w:t xml:space="preserve">)</w:t>
+      </w:r>
+      <w:r>
+        <w:br/>
+      </w:r>
+      <w:r>
+        <w:br/>
+      </w:r>
+      <w:r>
+        <w:rPr>
+          <w:rStyle w:val="ControlFlowTok"/>
+        </w:rPr>
         <w:t xml:space="preserve">with</w:t>
       </w:r>
       <w:r>
@@ -47563,7 +47908,25 @@
         <w:rPr>
           <w:rStyle w:val="NormalTok"/>
         </w:rPr>
-        <w:t xml:space="preserve">(database_url) </w:t>
+        <w:t xml:space="preserve">(database_url, connect_timeout</w:t>
+      </w:r>
+      <w:r>
+        <w:rPr>
+          <w:rStyle w:val="OperatorTok"/>
+        </w:rPr>
+        <w:t xml:space="preserve">=</w:t>
+      </w:r>
+      <w:r>
+        <w:rPr>
+          <w:rStyle w:val="DecValTok"/>
+        </w:rPr>
+        <w:t xml:space="preserve">10</w:t>
+      </w:r>
+      <w:r>
+        <w:rPr>
+          <w:rStyle w:val="NormalTok"/>
+        </w:rPr>
+        <w:t xml:space="preserve">) </w:t>
       </w:r>
       <w:r>
         <w:rPr>
@@ -47664,7 +48027,43 @@
         <w:t xml:space="preserve"> </w:t>
       </w:r>
       <w:r>
-        <w:t xml:space="preserve">compatible pooler URI rather than changing database code randomly.</w:t>
+        <w:t xml:space="preserve">compatible session-pooler URI rather than changing database code randomly.</w:t>
+      </w:r>
+      <w:r>
+        <w:t xml:space="preserve"> </w:t>
+      </w:r>
+      <w:r>
+        <w:rPr>
+          <w:rStyle w:val="VerbatimChar"/>
+        </w:rPr>
+        <w:t xml:space="preserve">sslmode=require</w:t>
+      </w:r>
+      <w:r>
+        <w:t xml:space="preserve"> </w:t>
+      </w:r>
+      <w:r>
+        <w:t xml:space="preserve">prevents an unencrypted fallback but does not verify server</w:t>
+      </w:r>
+      <w:r>
+        <w:t xml:space="preserve"> </w:t>
+      </w:r>
+      <w:r>
+        <w:t xml:space="preserve">identity. For production, use</w:t>
+      </w:r>
+      <w:r>
+        <w:t xml:space="preserve"> </w:t>
+      </w:r>
+      <w:r>
+        <w:rPr>
+          <w:rStyle w:val="VerbatimChar"/>
+        </w:rPr>
+        <w:t xml:space="preserve">verify-full</w:t>
+      </w:r>
+      <w:r>
+        <w:t xml:space="preserve"> </w:t>
+      </w:r>
+      <w:r>
+        <w:t xml:space="preserve">with the provider's CA certificate.</w:t>
       </w:r>
     </w:p>
     <w:bookmarkEnd w:id="395"/>

</xml_diff>

<commit_message>
Improve publication format QA and metadata
</commit_message>
<xml_diff>
--- a/CST4714_OER_Rebuild/publication/exports/operating_cloud_databases_v1.0.0-rc.1.docx
+++ b/CST4714_OER_Rebuild/publication/exports/operating_cloud_databases_v1.0.0-rc.1.docx
@@ -31591,7 +31591,7 @@
         </w:numPr>
       </w:pPr>
       <w:r>
-        <w:t xml:space="preserve">Carlo Strozzi's NoSQL RDBMS:</w:t>
+        <w:t xml:space="preserve">Debian's preserved package record for Carlo Strozzi's NoSQL RDBMS:</w:t>
       </w:r>
       <w:r>
         <w:t xml:space="preserve"> </w:t>
@@ -31601,7 +31601,7 @@
           <w:rPr>
             <w:rStyle w:val="Hyperlink"/>
           </w:rPr>
-          <w:t xml:space="preserve">https://www.strozzi.it/cgi-bin/CSA/tw7/I/en_US/NoSQL/Home%20Page</w:t>
+          <w:t xml:space="preserve">https://sources.debian.org/src/nosql/3.1-4/nosql.lsm/</w:t>
         </w:r>
       </w:hyperlink>
     </w:p>

</xml_diff>